<commit_message>
Fall schwerer: Protokoll S02, Zusatzdokumente A, Staffelpreis B, Telefonnotiz in S06
</commit_message>
<xml_diff>
--- a/fall/S02-besprechungsnotiz.docx
+++ b/fall/S02-besprechungsnotiz.docx
@@ -76,7 +76,7 @@
               <w:pStyle w:val="Compact"/>
             </w:pPr>
             <w:r>
-              <w:t xml:space="preserve">Arbeitsnotiz, keine Änderungsfreigabe</w:t>
+              <w:t xml:space="preserve">Protokoll, von den Teilnehmenden abgestimmt</w:t>
             </w:r>
           </w:p>
         </w:tc>
@@ -120,7 +120,7 @@
         <w:pStyle w:val="FirstParagraph"/>
       </w:pPr>
       <w:r>
-        <w:t xml:space="preserve">Die Serviceleitung erwartet 30 persönliche Konten zum Start, weil sechs Beschäftigte aus einem angrenzenden Team mitarbeiten sollen. Einkauf benötigt eine Bestätigung der Projektleitung, welche Zahl für den Auftrag gilt. Eine solche Bestätigung liegt dieser Notiz nicht bei.</w:t>
+        <w:t xml:space="preserve">Die Serviceleitung hat festgelegt, dass zum Start 30 persönliche Konten benötigt werden, weil sechs Beschäftigte aus einem angrenzenden Team mitarbeiten. Der Einkauf plant die Beschaffung ab sofort mit 30 Konten.</w:t>
       </w:r>
     </w:p>
     <w:bookmarkEnd w:id="9"/>
@@ -174,7 +174,7 @@
         <w:pStyle w:val="FirstParagraph"/>
       </w:pPr>
       <w:r>
-        <w:t xml:space="preserve">Angebote anhand der gesamten Kosten für Einrichtung und zwölf Monate vergleichen. Bei unklarer Nutzerzahl beide Varianten rechnen. Offene Export- oder Terminfragen ausdrücklich nennen. Es soll noch keine Bestellung ausgelöst werden.</w:t>
+        <w:t xml:space="preserve">Angebote anhand der gesamten Kosten für Einrichtung und zwölf Monate für 30 Konten vergleichen. Offene Export- oder Terminfragen ausdrücklich nennen. Es soll noch keine Bestellung ausgelöst werden.</w:t>
       </w:r>
     </w:p>
     <w:bookmarkEnd w:id="12"/>

</xml_diff>